<commit_message>
Nueva version del Informe
</commit_message>
<xml_diff>
--- a/docs/informe_presencia_espana_congresos_informatica_2026.docx
+++ b/docs/informe_presencia_espana_congresos_informatica_2026.docx
@@ -989,7 +989,15 @@
                 <w:noProof/>
                 <w:lang w:val="es-ES"/>
               </w:rPr>
-              <w:t>10. Conclusiones</w:t>
+              <w:t>10. Conclusione</w:t>
+            </w:r>
+            <w:r>
+              <w:rPr>
+                <w:rStyle w:val="Hipervnculo"/>
+                <w:noProof/>
+                <w:lang w:val="es-ES"/>
+              </w:rPr>
+              <w:t>s</w:t>
             </w:r>
             <w:r>
               <w:rPr>
@@ -16960,7 +16968,21 @@
           <w:color w:val="000000"/>
           <w:lang w:val="es-ES"/>
         </w:rPr>
-        <w:t>El comportamiento por áreas no es homogéneo. Redes experimenta un crecimiento continuo y significativo. Sistemas mantiene una posición sólida aunque algo decreciente. IA/ML combina el mayor volumen absoluto con pérdida relativa reciente. Teoría y HCI muestran las caídas más sostenidas.</w:t>
+        <w:t>El comportamiento por áreas no es homogéneo. Redes experimenta un crecimiento continuo y significativo. Sistemas</w:t>
+      </w:r>
+      <w:r>
+        <w:rPr>
+          <w:color w:val="000000"/>
+          <w:lang w:val="es-ES"/>
+        </w:rPr>
+        <w:t>, arquitectura y computación</w:t>
+      </w:r>
+      <w:r>
+        <w:rPr>
+          <w:color w:val="000000"/>
+          <w:lang w:val="es-ES"/>
+        </w:rPr>
+        <w:t xml:space="preserve"> mantiene una posición sólida aunque algo decreciente. IA/ML combina el mayor volumen absoluto con pérdida relativa reciente. Teoría y HCI muestran las caídas más sostenidas.</w:t>
       </w:r>
     </w:p>
     <w:p>
@@ -16983,7 +17005,19 @@
         <w:rPr>
           <w:lang w:val="es-ES"/>
         </w:rPr>
-        <w:t>La media agregada oculta perfiles distintos. Redes mejora, Sistemas e Ingeniería del Software resisten mejor, IA/ML crece en volumen pero pierde cuota, y Teoría muestra una caída sostenida. Por eso el diagnóstico útil debe combinar lectura global y lectura por áreas.</w:t>
+        <w:t>La media agregada oculta perfiles distintos. Redes mejora, Sistemas</w:t>
+      </w:r>
+      <w:r>
+        <w:rPr>
+          <w:lang w:val="es-ES"/>
+        </w:rPr>
+        <w:t xml:space="preserve">, arquitectura y computación, </w:t>
+      </w:r>
+      <w:r>
+        <w:rPr>
+          <w:lang w:val="es-ES"/>
+        </w:rPr>
+        <w:t>e Ingeniería del Software resisten mejor, IA/ML crece en volumen pero pierde cuota, y Teoría muestra una caída sostenida. Por eso el diagnóstico útil debe combinar lectura global y lectura por áreas.</w:t>
       </w:r>
     </w:p>
     <w:p>
@@ -17000,7 +17034,21 @@
           <w:color w:val="000000"/>
           <w:lang w:val="es-ES"/>
         </w:rPr>
-        <w:t>La Figura 3 permite observar la heterogeneidad por áreas en la última ventana: la posición española es muy fuerte en Redes, intermedia en Sistemas e Ingeniería del Software, y más débil en IA/ML, HCI y Teoría.</w:t>
+        <w:t>La Figura 3 permite observar la heterogeneidad por áreas en la última ventana: la posición española es muy fuerte en Redes, intermedia en Sistemas</w:t>
+      </w:r>
+      <w:r>
+        <w:rPr>
+          <w:color w:val="000000"/>
+          <w:lang w:val="es-ES"/>
+        </w:rPr>
+        <w:t>, arquitectura y computación,</w:t>
+      </w:r>
+      <w:r>
+        <w:rPr>
+          <w:color w:val="000000"/>
+          <w:lang w:val="es-ES"/>
+        </w:rPr>
+        <w:t xml:space="preserve"> e Ingeniería del Software, y más débil en IA/ML, HCI y Teoría.</w:t>
       </w:r>
     </w:p>
     <w:p>
@@ -17019,9 +17067,9 @@
           <w:lang w:val="es-ES"/>
         </w:rPr>
         <w:drawing>
-          <wp:inline distT="0" distB="0" distL="0" distR="0" wp14:anchorId="30D15632" wp14:editId="69E478EE">
-            <wp:extent cx="5498251" cy="3194005"/>
-            <wp:effectExtent l="0" t="0" r="7620" b="6985"/>
+          <wp:inline distT="0" distB="0" distL="0" distR="0" wp14:anchorId="30D15632" wp14:editId="271DF1D1">
+            <wp:extent cx="4976536" cy="2890934"/>
+            <wp:effectExtent l="0" t="0" r="0" b="5080"/>
             <wp:docPr id="3" name="Imagen 3"/>
             <wp:cNvGraphicFramePr>
               <a:graphicFrameLocks xmlns:a="http://schemas.openxmlformats.org/drawingml/2006/main" noChangeAspect="1"/>
@@ -17051,7 +17099,7 @@
                   <pic:spPr bwMode="auto">
                     <a:xfrm>
                       <a:off x="0" y="0"/>
-                      <a:ext cx="5517533" cy="3205206"/>
+                      <a:ext cx="4997962" cy="2903381"/>
                     </a:xfrm>
                     <a:prstGeom prst="rect">
                       <a:avLst/>
@@ -17180,7 +17228,21 @@
           <w:color w:val="000000"/>
           <w:lang w:val="es-ES"/>
         </w:rPr>
-        <w:t>Sistemas mantiene una cuota europea del 10,04 % en 2001–2005, que desciende gradualmente hasta el 6,82 % en 2021–2025, conservando el 6.º puesto europeo en la última ventana. La cobertura es alta (90,99 %) y los congresos IPDPS y DATE concentran la mayor parte de la presencia española. Es un área de fortaleza histórica que muestra cierta pérdida relativa, aunque sin el descenso brusco observado en otras áreas.</w:t>
+        <w:t>Sistemas</w:t>
+      </w:r>
+      <w:r>
+        <w:rPr>
+          <w:color w:val="000000"/>
+          <w:lang w:val="es-ES"/>
+        </w:rPr>
+        <w:t>, arquitectura y computación</w:t>
+      </w:r>
+      <w:r>
+        <w:rPr>
+          <w:color w:val="000000"/>
+          <w:lang w:val="es-ES"/>
+        </w:rPr>
+        <w:t xml:space="preserve"> mantiene una cuota europea del 10,04 % en 2001–2005, que desciende gradualmente hasta el 6,82 % en 2021–2025, conservando el 6.º puesto europeo en la última ventana. La cobertura es alta (90,99 %) y los congresos IPDPS y DATE concentran la mayor parte de la presencia española. Es un área de fortaleza histórica que muestra cierta pérdida relativa, aunque sin el descenso brusco observado en otras áreas.</w:t>
       </w:r>
     </w:p>
     <w:p>
@@ -22259,8 +22321,8 @@
       <w:tblGrid>
         <w:gridCol w:w="1670"/>
         <w:gridCol w:w="793"/>
-        <w:gridCol w:w="2120"/>
-        <w:gridCol w:w="765"/>
+        <w:gridCol w:w="2214"/>
+        <w:gridCol w:w="671"/>
         <w:gridCol w:w="1063"/>
         <w:gridCol w:w="2278"/>
       </w:tblGrid>
@@ -22338,7 +22400,7 @@
         </w:tc>
         <w:tc>
           <w:tcPr>
-            <w:tcW w:w="2120" w:type="dxa"/>
+            <w:tcW w:w="2214" w:type="dxa"/>
             <w:tcBorders>
               <w:top w:val="single" w:sz="1" w:space="0" w:color="BDD7EE"/>
               <w:left w:val="single" w:sz="1" w:space="0" w:color="BDD7EE"/>
@@ -22372,7 +22434,7 @@
         </w:tc>
         <w:tc>
           <w:tcPr>
-            <w:tcW w:w="765" w:type="dxa"/>
+            <w:tcW w:w="671" w:type="dxa"/>
             <w:tcBorders>
               <w:top w:val="single" w:sz="1" w:space="0" w:color="BDD7EE"/>
               <w:left w:val="single" w:sz="1" w:space="0" w:color="BDD7EE"/>
@@ -22543,7 +22605,7 @@
         </w:tc>
         <w:tc>
           <w:tcPr>
-            <w:tcW w:w="2120" w:type="dxa"/>
+            <w:tcW w:w="2214" w:type="dxa"/>
             <w:tcBorders>
               <w:top w:val="single" w:sz="1" w:space="0" w:color="BDD7EE"/>
               <w:left w:val="single" w:sz="1" w:space="0" w:color="BDD7EE"/>
@@ -22572,7 +22634,7 @@
         </w:tc>
         <w:tc>
           <w:tcPr>
-            <w:tcW w:w="765" w:type="dxa"/>
+            <w:tcW w:w="671" w:type="dxa"/>
             <w:tcBorders>
               <w:top w:val="single" w:sz="1" w:space="0" w:color="BDD7EE"/>
               <w:left w:val="single" w:sz="1" w:space="0" w:color="BDD7EE"/>
@@ -22739,7 +22801,7 @@
         </w:tc>
         <w:tc>
           <w:tcPr>
-            <w:tcW w:w="2120" w:type="dxa"/>
+            <w:tcW w:w="2214" w:type="dxa"/>
             <w:tcBorders>
               <w:top w:val="single" w:sz="1" w:space="0" w:color="BDD7EE"/>
               <w:left w:val="single" w:sz="1" w:space="0" w:color="BDD7EE"/>
@@ -22768,7 +22830,7 @@
         </w:tc>
         <w:tc>
           <w:tcPr>
-            <w:tcW w:w="765" w:type="dxa"/>
+            <w:tcW w:w="671" w:type="dxa"/>
             <w:tcBorders>
               <w:top w:val="single" w:sz="1" w:space="0" w:color="BDD7EE"/>
               <w:left w:val="single" w:sz="1" w:space="0" w:color="BDD7EE"/>
@@ -22935,7 +22997,7 @@
         </w:tc>
         <w:tc>
           <w:tcPr>
-            <w:tcW w:w="2120" w:type="dxa"/>
+            <w:tcW w:w="2214" w:type="dxa"/>
             <w:tcBorders>
               <w:top w:val="single" w:sz="1" w:space="0" w:color="BDD7EE"/>
               <w:left w:val="single" w:sz="1" w:space="0" w:color="BDD7EE"/>
@@ -22964,7 +23026,7 @@
         </w:tc>
         <w:tc>
           <w:tcPr>
-            <w:tcW w:w="765" w:type="dxa"/>
+            <w:tcW w:w="671" w:type="dxa"/>
             <w:tcBorders>
               <w:top w:val="single" w:sz="1" w:space="0" w:color="BDD7EE"/>
               <w:left w:val="single" w:sz="1" w:space="0" w:color="BDD7EE"/>
@@ -23131,7 +23193,7 @@
         </w:tc>
         <w:tc>
           <w:tcPr>
-            <w:tcW w:w="2120" w:type="dxa"/>
+            <w:tcW w:w="2214" w:type="dxa"/>
             <w:tcBorders>
               <w:top w:val="single" w:sz="1" w:space="0" w:color="BDD7EE"/>
               <w:left w:val="single" w:sz="1" w:space="0" w:color="BDD7EE"/>
@@ -23160,7 +23222,7 @@
         </w:tc>
         <w:tc>
           <w:tcPr>
-            <w:tcW w:w="765" w:type="dxa"/>
+            <w:tcW w:w="671" w:type="dxa"/>
             <w:tcBorders>
               <w:top w:val="single" w:sz="1" w:space="0" w:color="BDD7EE"/>
               <w:left w:val="single" w:sz="1" w:space="0" w:color="BDD7EE"/>
@@ -23327,7 +23389,7 @@
         </w:tc>
         <w:tc>
           <w:tcPr>
-            <w:tcW w:w="2120" w:type="dxa"/>
+            <w:tcW w:w="2214" w:type="dxa"/>
             <w:tcBorders>
               <w:top w:val="single" w:sz="1" w:space="0" w:color="BDD7EE"/>
               <w:left w:val="single" w:sz="1" w:space="0" w:color="BDD7EE"/>
@@ -23356,7 +23418,7 @@
         </w:tc>
         <w:tc>
           <w:tcPr>
-            <w:tcW w:w="765" w:type="dxa"/>
+            <w:tcW w:w="671" w:type="dxa"/>
             <w:tcBorders>
               <w:top w:val="single" w:sz="1" w:space="0" w:color="BDD7EE"/>
               <w:left w:val="single" w:sz="1" w:space="0" w:color="BDD7EE"/>
@@ -23523,7 +23585,7 @@
         </w:tc>
         <w:tc>
           <w:tcPr>
-            <w:tcW w:w="2120" w:type="dxa"/>
+            <w:tcW w:w="2214" w:type="dxa"/>
             <w:tcBorders>
               <w:top w:val="single" w:sz="1" w:space="0" w:color="BDD7EE"/>
               <w:left w:val="single" w:sz="1" w:space="0" w:color="BDD7EE"/>
@@ -23552,7 +23614,7 @@
         </w:tc>
         <w:tc>
           <w:tcPr>
-            <w:tcW w:w="765" w:type="dxa"/>
+            <w:tcW w:w="671" w:type="dxa"/>
             <w:tcBorders>
               <w:top w:val="single" w:sz="1" w:space="0" w:color="BDD7EE"/>
               <w:left w:val="single" w:sz="1" w:space="0" w:color="BDD7EE"/>
@@ -23719,7 +23781,7 @@
         </w:tc>
         <w:tc>
           <w:tcPr>
-            <w:tcW w:w="2120" w:type="dxa"/>
+            <w:tcW w:w="2214" w:type="dxa"/>
             <w:tcBorders>
               <w:top w:val="single" w:sz="1" w:space="0" w:color="BDD7EE"/>
               <w:left w:val="single" w:sz="1" w:space="0" w:color="BDD7EE"/>
@@ -23748,7 +23810,7 @@
         </w:tc>
         <w:tc>
           <w:tcPr>
-            <w:tcW w:w="765" w:type="dxa"/>
+            <w:tcW w:w="671" w:type="dxa"/>
             <w:tcBorders>
               <w:top w:val="single" w:sz="1" w:space="0" w:color="BDD7EE"/>
               <w:left w:val="single" w:sz="1" w:space="0" w:color="BDD7EE"/>
@@ -23915,7 +23977,7 @@
         </w:tc>
         <w:tc>
           <w:tcPr>
-            <w:tcW w:w="2120" w:type="dxa"/>
+            <w:tcW w:w="2214" w:type="dxa"/>
             <w:tcBorders>
               <w:top w:val="single" w:sz="1" w:space="0" w:color="BDD7EE"/>
               <w:left w:val="single" w:sz="1" w:space="0" w:color="BDD7EE"/>
@@ -23944,7 +24006,7 @@
         </w:tc>
         <w:tc>
           <w:tcPr>
-            <w:tcW w:w="765" w:type="dxa"/>
+            <w:tcW w:w="671" w:type="dxa"/>
             <w:tcBorders>
               <w:top w:val="single" w:sz="1" w:space="0" w:color="BDD7EE"/>
               <w:left w:val="single" w:sz="1" w:space="0" w:color="BDD7EE"/>
@@ -24112,7 +24174,7 @@
         </w:tc>
         <w:tc>
           <w:tcPr>
-            <w:tcW w:w="2120" w:type="dxa"/>
+            <w:tcW w:w="2214" w:type="dxa"/>
             <w:tcBorders>
               <w:top w:val="single" w:sz="1" w:space="0" w:color="BDD7EE"/>
               <w:left w:val="single" w:sz="1" w:space="0" w:color="BDD7EE"/>
@@ -24141,7 +24203,7 @@
         </w:tc>
         <w:tc>
           <w:tcPr>
-            <w:tcW w:w="765" w:type="dxa"/>
+            <w:tcW w:w="671" w:type="dxa"/>
             <w:tcBorders>
               <w:top w:val="single" w:sz="1" w:space="0" w:color="BDD7EE"/>
               <w:left w:val="single" w:sz="1" w:space="0" w:color="BDD7EE"/>
@@ -24308,7 +24370,7 @@
         </w:tc>
         <w:tc>
           <w:tcPr>
-            <w:tcW w:w="2120" w:type="dxa"/>
+            <w:tcW w:w="2214" w:type="dxa"/>
             <w:tcBorders>
               <w:top w:val="single" w:sz="1" w:space="0" w:color="BDD7EE"/>
               <w:left w:val="single" w:sz="1" w:space="0" w:color="BDD7EE"/>
@@ -24337,7 +24399,7 @@
         </w:tc>
         <w:tc>
           <w:tcPr>
-            <w:tcW w:w="765" w:type="dxa"/>
+            <w:tcW w:w="671" w:type="dxa"/>
             <w:tcBorders>
               <w:top w:val="single" w:sz="1" w:space="0" w:color="BDD7EE"/>
               <w:left w:val="single" w:sz="1" w:space="0" w:color="BDD7EE"/>
@@ -24504,7 +24566,7 @@
         </w:tc>
         <w:tc>
           <w:tcPr>
-            <w:tcW w:w="2120" w:type="dxa"/>
+            <w:tcW w:w="2214" w:type="dxa"/>
             <w:tcBorders>
               <w:top w:val="single" w:sz="1" w:space="0" w:color="BDD7EE"/>
               <w:left w:val="single" w:sz="1" w:space="0" w:color="BDD7EE"/>
@@ -24535,13 +24597,29 @@
                 <w:sz w:val="18"/>
                 <w:szCs w:val="18"/>
               </w:rPr>
-              <w:t>, Arq. yComp.</w:t>
-            </w:r>
-          </w:p>
-        </w:tc>
-        <w:tc>
-          <w:tcPr>
-            <w:tcW w:w="765" w:type="dxa"/>
+              <w:t xml:space="preserve">, Arq. </w:t>
+            </w:r>
+            <w:r>
+              <w:rPr>
+                <w:color w:val="000000"/>
+                <w:sz w:val="18"/>
+                <w:szCs w:val="18"/>
+              </w:rPr>
+              <w:t xml:space="preserve">y </w:t>
+            </w:r>
+            <w:r>
+              <w:rPr>
+                <w:color w:val="000000"/>
+                <w:sz w:val="18"/>
+                <w:szCs w:val="18"/>
+              </w:rPr>
+              <w:t>Comp.</w:t>
+            </w:r>
+          </w:p>
+        </w:tc>
+        <w:tc>
+          <w:tcPr>
+            <w:tcW w:w="671" w:type="dxa"/>
             <w:tcBorders>
               <w:top w:val="single" w:sz="1" w:space="0" w:color="BDD7EE"/>
               <w:left w:val="single" w:sz="1" w:space="0" w:color="BDD7EE"/>
@@ -24708,7 +24786,7 @@
         </w:tc>
         <w:tc>
           <w:tcPr>
-            <w:tcW w:w="2120" w:type="dxa"/>
+            <w:tcW w:w="2214" w:type="dxa"/>
             <w:tcBorders>
               <w:top w:val="single" w:sz="1" w:space="0" w:color="BDD7EE"/>
               <w:left w:val="single" w:sz="1" w:space="0" w:color="BDD7EE"/>
@@ -24737,7 +24815,7 @@
         </w:tc>
         <w:tc>
           <w:tcPr>
-            <w:tcW w:w="765" w:type="dxa"/>
+            <w:tcW w:w="671" w:type="dxa"/>
             <w:tcBorders>
               <w:top w:val="single" w:sz="1" w:space="0" w:color="BDD7EE"/>
               <w:left w:val="single" w:sz="1" w:space="0" w:color="BDD7EE"/>
@@ -24904,7 +24982,7 @@
         </w:tc>
         <w:tc>
           <w:tcPr>
-            <w:tcW w:w="2120" w:type="dxa"/>
+            <w:tcW w:w="2214" w:type="dxa"/>
             <w:tcBorders>
               <w:top w:val="single" w:sz="1" w:space="0" w:color="BDD7EE"/>
               <w:left w:val="single" w:sz="1" w:space="0" w:color="BDD7EE"/>
@@ -24933,7 +25011,7 @@
         </w:tc>
         <w:tc>
           <w:tcPr>
-            <w:tcW w:w="765" w:type="dxa"/>
+            <w:tcW w:w="671" w:type="dxa"/>
             <w:tcBorders>
               <w:top w:val="single" w:sz="1" w:space="0" w:color="BDD7EE"/>
               <w:left w:val="single" w:sz="1" w:space="0" w:color="BDD7EE"/>
@@ -25100,7 +25178,7 @@
         </w:tc>
         <w:tc>
           <w:tcPr>
-            <w:tcW w:w="2120" w:type="dxa"/>
+            <w:tcW w:w="2214" w:type="dxa"/>
             <w:tcBorders>
               <w:top w:val="single" w:sz="1" w:space="0" w:color="BDD7EE"/>
               <w:left w:val="single" w:sz="1" w:space="0" w:color="BDD7EE"/>
@@ -25129,7 +25207,7 @@
         </w:tc>
         <w:tc>
           <w:tcPr>
-            <w:tcW w:w="765" w:type="dxa"/>
+            <w:tcW w:w="671" w:type="dxa"/>
             <w:tcBorders>
               <w:top w:val="single" w:sz="1" w:space="0" w:color="BDD7EE"/>
               <w:left w:val="single" w:sz="1" w:space="0" w:color="BDD7EE"/>
@@ -25296,7 +25374,7 @@
         </w:tc>
         <w:tc>
           <w:tcPr>
-            <w:tcW w:w="2120" w:type="dxa"/>
+            <w:tcW w:w="2214" w:type="dxa"/>
             <w:tcBorders>
               <w:top w:val="single" w:sz="1" w:space="0" w:color="BDD7EE"/>
               <w:left w:val="single" w:sz="1" w:space="0" w:color="BDD7EE"/>
@@ -25325,7 +25403,7 @@
         </w:tc>
         <w:tc>
           <w:tcPr>
-            <w:tcW w:w="765" w:type="dxa"/>
+            <w:tcW w:w="671" w:type="dxa"/>
             <w:tcBorders>
               <w:top w:val="single" w:sz="1" w:space="0" w:color="BDD7EE"/>
               <w:left w:val="single" w:sz="1" w:space="0" w:color="BDD7EE"/>
@@ -25571,7 +25649,55 @@
           <w:lang w:val="es-ES"/>
         </w:rPr>
         <w:lastRenderedPageBreak/>
-        <w:t>Otros campos también presentan ciclos de expansión y maduración. En el período analizado, Teoría muestra una tendencia decreciente continua: su cuota dentro de UE27+Reino Unido pasa del 5,83 % en 2001–2005 al 2,17 % en 2021–2025, lo que sugiere que la comunidad española no ha crecido al mismo ritmo que el bloque europeo en esta área a lo largo de todo el período. El informe no cubre fases anteriores a 2001, por lo que no es posible determinar si esa tendencia refleja un desplazamiento de la agenda o una característica estructural de más largo plazo. Del mismo modo, los sistemas, la arquitectura de computadores, el hardware, los procesadores, la computación de altas prestaciones y los sistemas distribuidos han atravesado fases vinculadas a cambios tecnológicos e industriales concretos. Estas dinámicas pueden producir picos y valles en la producción por área sin que ello implique necesariamente una mejora o deterioro lineal de la capacidad científica nacional.</w:t>
+        <w:t xml:space="preserve">Otros campos también presentan ciclos de expansión y maduración. En el período analizado, Teoría muestra una tendencia decreciente continua: su cuota dentro de UE27+Reino Unido pasa del 5,83 % en 2001–2005 al 2,17 % en 2021–2025, lo que sugiere que la comunidad española </w:t>
+      </w:r>
+      <w:r>
+        <w:rPr>
+          <w:lang w:val="es-ES"/>
+        </w:rPr>
+        <w:t xml:space="preserve">de esta área </w:t>
+      </w:r>
+      <w:r>
+        <w:rPr>
+          <w:lang w:val="es-ES"/>
+        </w:rPr>
+        <w:t xml:space="preserve">no ha crecido al mismo ritmo que el bloque europeo </w:t>
+      </w:r>
+      <w:r>
+        <w:rPr>
+          <w:lang w:val="es-ES"/>
+        </w:rPr>
+        <w:t>durante</w:t>
+      </w:r>
+      <w:r>
+        <w:rPr>
+          <w:lang w:val="es-ES"/>
+        </w:rPr>
+        <w:t xml:space="preserve"> e</w:t>
+      </w:r>
+      <w:r>
+        <w:rPr>
+          <w:lang w:val="es-ES"/>
+        </w:rPr>
+        <w:t>ste</w:t>
+      </w:r>
+      <w:r>
+        <w:rPr>
+          <w:lang w:val="es-ES"/>
+        </w:rPr>
+        <w:t xml:space="preserve"> período. El informe no cubre fases anteriores a 2001, por lo que no es posible determinar si esa tendencia refleja un desplazamiento de agenda o una característica estructural de más largo plazo. </w:t>
+      </w:r>
+      <w:r>
+        <w:rPr>
+          <w:lang w:val="es-ES"/>
+        </w:rPr>
+        <w:t>Igualmente</w:t>
+      </w:r>
+      <w:r>
+        <w:rPr>
+          <w:lang w:val="es-ES"/>
+        </w:rPr>
+        <w:t>, los sistemas, la arquitectura de computadores, el hardware, los procesadores, la computación de altas prestaciones y los sistemas distribuidos han atravesado fases vinculadas a cambios tecnológicos e industriales concretos. Estas dinámicas pueden producir picos y valles en la producción por área sin que ello implique necesariamente una mejora o deterioro de la capacidad científica nacional.</w:t>
       </w:r>
     </w:p>
     <w:p>
@@ -25592,6 +25718,7 @@
     <w:p>
       <w:pPr>
         <w:pStyle w:val="Ttulo2"/>
+        <w:spacing w:before="180"/>
         <w:rPr>
           <w:lang w:val="es-ES"/>
         </w:rPr>
@@ -25660,6 +25787,7 @@
     <w:p>
       <w:pPr>
         <w:pStyle w:val="Ttulo2"/>
+        <w:spacing w:before="180"/>
         <w:rPr>
           <w:lang w:val="es-ES"/>
         </w:rPr>
@@ -25706,6 +25834,7 @@
     <w:p>
       <w:pPr>
         <w:pStyle w:val="Ttulo2"/>
+        <w:spacing w:before="180"/>
         <w:rPr>
           <w:lang w:val="es-ES"/>
         </w:rPr>
@@ -25746,28 +25875,22 @@
         <w:rPr>
           <w:lang w:val="es-ES"/>
         </w:rPr>
-        <w:t xml:space="preserve">Esta especialización ayuda a interpretar tanto las fortalezas como las debilidades agregadas. Por ejemplo, España alcanza cuotas elevadas en algunos congresos concretos —como ER, ICDAR, IPDPS, CaiSE, MSWIM o INFOCOM—, pero presenta cuotas menores en varios congresos de IA/ML de crecimiento muy </w:t>
-      </w:r>
+        <w:t>Esta especialización ayuda a interpretar tanto las fortalezas como las debilidades agregadas. Por ejemplo, España alcanza cuotas elevadas en algunos congresos concretos —como ER, ICDAR, IPDPS, CaiSE, MSWIM o INFOCOM—, pero presenta cuotas menores en varios congresos de IA/ML de crecimiento muy acelerado, como NeurIPS, ICML, ICLR o CVPR. Así, el perfil español combina nichos de fortaleza clara con menor peso relativo en algunos de los foros que más han expandido el corpus durante la última década.</w:t>
+      </w:r>
+    </w:p>
+    <w:p>
+      <w:pPr>
+        <w:pStyle w:val="Ttulo2"/>
+        <w:rPr>
+          <w:lang w:val="es-ES"/>
+        </w:rPr>
+      </w:pPr>
+      <w:bookmarkStart w:id="36" w:name="_Toc229656316"/>
       <w:r>
         <w:rPr>
           <w:lang w:val="es-ES"/>
         </w:rPr>
         <w:lastRenderedPageBreak/>
-        <w:t>acelerado, como NeurIPS, ICML, ICLR o CVPR. Así, el perfil español combina nichos de fortaleza clara con menor peso relativo en algunos de los foros que más han expandido el corpus durante la última década.</w:t>
-      </w:r>
-    </w:p>
-    <w:p>
-      <w:pPr>
-        <w:pStyle w:val="Ttulo2"/>
-        <w:rPr>
-          <w:lang w:val="es-ES"/>
-        </w:rPr>
-      </w:pPr>
-      <w:bookmarkStart w:id="36" w:name="_Toc229656316"/>
-      <w:r>
-        <w:rPr>
-          <w:lang w:val="es-ES"/>
-        </w:rPr>
         <w:t>9.5. Comparación con Italia</w:t>
       </w:r>
       <w:bookmarkEnd w:id="36"/>
@@ -25906,7 +26029,19 @@
         <w:rPr>
           <w:lang w:val="es-ES"/>
         </w:rPr>
-        <w:t>Una limitación transversal del análisis es la cobertura desigual por congreso y área. Aunque la cobertura acumulada del corpus es alta, algunos congresos concretos presentan resolución de afiliaciones inferior al 30 %, especialmente en Seguridad, Sistemas e IA/ML. Las conclusiones sobre NDSS, USENIX, USENIX-Security, AISTATS, AAMAS, OSDI, FAST e ICWSM deben interpretarse con mayor cautela que las de áreas y congresos con cobertura alta.</w:t>
+        <w:t>Una limitación transversal del análisis es la cobertura desigual por congreso y área. Aunque la cobertura acumulada del corpus es alta, algunos congresos concretos presentan resolución de afiliaciones inferior al 30 %, especialmente en Seguridad, Sistemas</w:t>
+      </w:r>
+      <w:r>
+        <w:rPr>
+          <w:lang w:val="es-ES"/>
+        </w:rPr>
+        <w:t>, arquitectura y computación,</w:t>
+      </w:r>
+      <w:r>
+        <w:rPr>
+          <w:lang w:val="es-ES"/>
+        </w:rPr>
+        <w:t xml:space="preserve"> e IA/ML. Las conclusiones sobre NDSS, USENIX, USENIX-Security, AISTATS, AAMAS, OSDI, FAST e ICWSM deben interpretarse con mayor cautela que las de áreas y congresos con cobertura alta.</w:t>
       </w:r>
     </w:p>
     <w:p>
@@ -25921,7 +26056,19 @@
         <w:rPr>
           <w:lang w:val="es-ES"/>
         </w:rPr>
-        <w:t>Esta cautela no invalida las tendencias generales, porque el análisis se basa en más de 452.000 artículos con país identificado y una cobertura acumulada del 84,56 %. Sin embargo, sí aconseja interpretar los resultados de baja cobertura como aproximaciones conservadoras y no como mediciones exhaustivas de cada comunidad. Las tendencias globales y las comparaciones en áreas con cobertura alta —Redes, Ingeniería del Software, Bases de datos, HCI y buena parte de Sistemas— son metodológicamente más robustas.</w:t>
+        <w:t>Esta cautela no invalida las tendencias generales, porque el análisis se basa en más de 452.000 artículos con país identificado y una cobertura acumulada del 84,56 %. Sin embargo, sí aconseja interpretar los resultados de baja cobertura como aproximaciones conservadoras y no como mediciones exhaustivas de cada comunidad. Las tendencias globales y las comparaciones en áreas con cobertura alta —Redes, Ingeniería del Software, Bases de datos, HCI y buena parte de Sistemas</w:t>
+      </w:r>
+      <w:r>
+        <w:rPr>
+          <w:lang w:val="es-ES"/>
+        </w:rPr>
+        <w:t>, arquitectura y computación</w:t>
+      </w:r>
+      <w:r>
+        <w:rPr>
+          <w:lang w:val="es-ES"/>
+        </w:rPr>
+        <w:t>— son metodológicamente más robustas.</w:t>
       </w:r>
     </w:p>
     <w:p>
@@ -25971,6 +26118,12 @@
         <w:rPr>
           <w:lang w:val="es-ES"/>
         </w:rPr>
+        <w:t xml:space="preserve">10.1 </w:t>
+      </w:r>
+      <w:r>
+        <w:rPr>
+          <w:lang w:val="es-ES"/>
+        </w:rPr>
         <w:t>Conclusión general</w:t>
       </w:r>
       <w:bookmarkEnd w:id="40"/>
@@ -26002,7 +26155,19 @@
         <w:rPr>
           <w:lang w:val="es-ES"/>
         </w:rPr>
-        <w:t>La evolución no es homogénea por áreas. Redes constituye una fortaleza clara; Ingeniería del Software y Sistemas mantienen posiciones relativamente sólidas; IA/ML aporta mucho volumen, pero pierde cuota relativa; Teoría muestra una caída sostenida. Por tanto, el informe no describe una trayectoria uniforme de la Informática española, sino un perfil diferenciado por áreas y niveles de congreso.</w:t>
+        <w:t>La evolución no es homogénea por áreas. Redes constituye una fortaleza clara; Ingeniería del Software y Sistemas</w:t>
+      </w:r>
+      <w:r>
+        <w:rPr>
+          <w:lang w:val="es-ES"/>
+        </w:rPr>
+        <w:t>, arquitectura y computación</w:t>
+      </w:r>
+      <w:r>
+        <w:rPr>
+          <w:lang w:val="es-ES"/>
+        </w:rPr>
+        <w:t xml:space="preserve"> mantienen posiciones relativamente sólidas; IA/ML aporta mucho volumen, pero pierde cuota relativa; Teoría muestra una caída sostenida. Por tanto, el informe no describe una trayectoria uniforme de la Informática española, sino un perfil diferenciado por áreas y niveles de congreso.</w:t>
       </w:r>
     </w:p>
     <w:p>
@@ -26044,7 +26209,19 @@
         <w:rPr>
           <w:lang w:val="es-ES"/>
         </w:rPr>
-        <w:t>10.1 Respuesta a las preguntas planteadas al principio del informe</w:t>
+        <w:t>10.</w:t>
+      </w:r>
+      <w:r>
+        <w:rPr>
+          <w:lang w:val="es-ES"/>
+        </w:rPr>
+        <w:t>2</w:t>
+      </w:r>
+      <w:r>
+        <w:rPr>
+          <w:lang w:val="es-ES"/>
+        </w:rPr>
+        <w:t xml:space="preserve"> Respuesta a las preguntas planteadas al principio del informe</w:t>
       </w:r>
       <w:bookmarkEnd w:id="41"/>
     </w:p>
@@ -26199,7 +26376,21 @@
           <w:color w:val="000000"/>
           <w:lang w:val="es-ES"/>
         </w:rPr>
-        <w:t>: Sí. Redes mejora de forma sostenida y alcanza el 14,612 % del bloque europeo en 2021–2025; Sistemas conserva una posición sólida; IA/ML y Teoría muestran pérdidas relativas claras; HCI y Seguridad requieren mayor cautela por cobertura o menor cuota.</w:t>
+        <w:t>: Sí. Redes mejora de forma sostenida y alcanza el 14,612 % del bloque europeo en 2021–2025; Sistemas</w:t>
+      </w:r>
+      <w:r>
+        <w:rPr>
+          <w:color w:val="000000"/>
+          <w:lang w:val="es-ES"/>
+        </w:rPr>
+        <w:t>, arquitectura y computación</w:t>
+      </w:r>
+      <w:r>
+        <w:rPr>
+          <w:color w:val="000000"/>
+          <w:lang w:val="es-ES"/>
+        </w:rPr>
+        <w:t xml:space="preserve"> conserva una posición sólida; IA/ML y Teoría muestran pérdidas relativas claras; HCI y Seguridad requieren mayor cautela por cobertura o menor cuota.</w:t>
       </w:r>
       <w:r>
         <w:rPr>
@@ -26435,7 +26626,19 @@
         <w:rPr>
           <w:lang w:val="es-ES"/>
         </w:rPr>
-        <w:t>10.2 Conclusiones principales</w:t>
+        <w:t>10.</w:t>
+      </w:r>
+      <w:r>
+        <w:rPr>
+          <w:lang w:val="es-ES"/>
+        </w:rPr>
+        <w:t>3</w:t>
+      </w:r>
+      <w:r>
+        <w:rPr>
+          <w:lang w:val="es-ES"/>
+        </w:rPr>
+        <w:t xml:space="preserve"> Conclusiones principales</w:t>
       </w:r>
       <w:bookmarkEnd w:id="42"/>
     </w:p>
@@ -26783,7 +26986,19 @@
         <w:rPr>
           <w:lang w:val="es-ES"/>
         </w:rPr>
-        <w:t>La cobertura acumulada del 84,56 % permite un análisis descriptivo robusto para la mayor parte del corpus. Las áreas de Seguridad e IA/ML, y algunos congresos específicos de Sistemas, presentan coberturas menores que exigen cautela en la interpretación.</w:t>
+        <w:t>La cobertura acumulada del 84,56 % permite un análisis descriptivo robusto para la mayor parte del corpus. Las áreas de Seguridad e IA/ML, y algunos congresos específicos de Sistemas</w:t>
+      </w:r>
+      <w:r>
+        <w:rPr>
+          <w:lang w:val="es-ES"/>
+        </w:rPr>
+        <w:t>, arquitectura y computación</w:t>
+      </w:r>
+      <w:r>
+        <w:rPr>
+          <w:lang w:val="es-ES"/>
+        </w:rPr>
+        <w:t>, presentan coberturas menores que exigen cautela en la interpretación.</w:t>
       </w:r>
     </w:p>
     <w:p>
@@ -26856,7 +27071,19 @@
         <w:rPr>
           <w:lang w:val="es-ES"/>
         </w:rPr>
-        <w:t>10.3. Robustez de las conclusiones</w:t>
+        <w:t>10.</w:t>
+      </w:r>
+      <w:r>
+        <w:rPr>
+          <w:lang w:val="es-ES"/>
+        </w:rPr>
+        <w:t>4</w:t>
+      </w:r>
+      <w:r>
+        <w:rPr>
+          <w:lang w:val="es-ES"/>
+        </w:rPr>
+        <w:t>. Robustez de las conclusiones</w:t>
       </w:r>
       <w:bookmarkEnd w:id="43"/>
     </w:p>
@@ -26884,10 +27111,16 @@
       </w:pPr>
       <w:bookmarkStart w:id="44" w:name="_Toc229656324"/>
       <w:r>
-        <w:rPr>
-          <w:lang w:val="es-ES"/>
-        </w:rPr>
-        <w:t>Conteo completo y fraccionario</w:t>
+        <w:t xml:space="preserve">10.4.1. </w:t>
+      </w:r>
+      <w:r>
+        <w:t>Conteo</w:t>
+      </w:r>
+      <w:r>
+        <w:rPr>
+          <w:lang w:val="es-ES"/>
+        </w:rPr>
+        <w:t xml:space="preserve"> completo y fraccionario</w:t>
       </w:r>
       <w:bookmarkEnd w:id="44"/>
     </w:p>
@@ -27524,6 +27757,9 @@
       </w:pPr>
       <w:r>
         <w:lastRenderedPageBreak/>
+        <w:t xml:space="preserve">10.4.2. </w:t>
+      </w:r>
+      <w:r>
         <w:t>Intervalos bootstrap</w:t>
       </w:r>
       <w:bookmarkEnd w:id="45"/>
@@ -28142,6 +28378,9 @@
       </w:pPr>
       <w:bookmarkStart w:id="46" w:name="_Toc229656326"/>
       <w:r>
+        <w:t xml:space="preserve">10.4.3. </w:t>
+      </w:r>
+      <w:r>
         <w:t>Sensibilidad por cobertura</w:t>
       </w:r>
       <w:bookmarkEnd w:id="46"/>
@@ -28466,6 +28705,15 @@
         <w:pStyle w:val="Ttulo3"/>
       </w:pPr>
       <w:bookmarkStart w:id="47" w:name="_Toc229656327"/>
+      <w:r>
+        <w:t>10.4.</w:t>
+      </w:r>
+      <w:r>
+        <w:t>4</w:t>
+      </w:r>
+      <w:r>
+        <w:t xml:space="preserve">. </w:t>
+      </w:r>
       <w:r>
         <w:t>Descomposición shift-share</w:t>
       </w:r>
@@ -28528,7 +28776,7 @@
         </w:tc>
         <w:tc>
           <w:tcPr>
-            <w:tcW w:w="1052" w:type="dxa"/>
+            <w:tcW w:w="1015" w:type="dxa"/>
             <w:shd w:val="clear" w:color="auto" w:fill="EDEDED"/>
           </w:tcPr>
           <w:p>
@@ -28542,7 +28790,7 @@
         </w:tc>
         <w:tc>
           <w:tcPr>
-            <w:tcW w:w="1381" w:type="dxa"/>
+            <w:tcW w:w="1483" w:type="dxa"/>
             <w:shd w:val="clear" w:color="auto" w:fill="EDEDED"/>
           </w:tcPr>
           <w:p>
@@ -28556,7 +28804,7 @@
         </w:tc>
         <w:tc>
           <w:tcPr>
-            <w:tcW w:w="1606" w:type="dxa"/>
+            <w:tcW w:w="1541" w:type="dxa"/>
             <w:shd w:val="clear" w:color="auto" w:fill="EDEDED"/>
           </w:tcPr>
           <w:p>
@@ -28624,7 +28872,7 @@
         </w:tc>
         <w:tc>
           <w:tcPr>
-            <w:tcW w:w="1052" w:type="dxa"/>
+            <w:tcW w:w="1015" w:type="dxa"/>
           </w:tcPr>
           <w:p>
             <w:pPr>
@@ -28637,7 +28885,7 @@
         </w:tc>
         <w:tc>
           <w:tcPr>
-            <w:tcW w:w="1381" w:type="dxa"/>
+            <w:tcW w:w="1483" w:type="dxa"/>
           </w:tcPr>
           <w:p>
             <w:pPr>
@@ -28650,7 +28898,7 @@
         </w:tc>
         <w:tc>
           <w:tcPr>
-            <w:tcW w:w="1606" w:type="dxa"/>
+            <w:tcW w:w="1541" w:type="dxa"/>
           </w:tcPr>
           <w:p>
             <w:pPr>
@@ -28714,7 +28962,7 @@
         </w:tc>
         <w:tc>
           <w:tcPr>
-            <w:tcW w:w="1052" w:type="dxa"/>
+            <w:tcW w:w="1015" w:type="dxa"/>
           </w:tcPr>
           <w:p>
             <w:pPr>
@@ -28727,7 +28975,7 @@
         </w:tc>
         <w:tc>
           <w:tcPr>
-            <w:tcW w:w="1381" w:type="dxa"/>
+            <w:tcW w:w="1483" w:type="dxa"/>
           </w:tcPr>
           <w:p>
             <w:pPr>
@@ -28740,7 +28988,7 @@
         </w:tc>
         <w:tc>
           <w:tcPr>
-            <w:tcW w:w="1606" w:type="dxa"/>
+            <w:tcW w:w="1541" w:type="dxa"/>
           </w:tcPr>
           <w:p>
             <w:pPr>
@@ -28797,6 +29045,15 @@
         <w:pStyle w:val="Ttulo3"/>
       </w:pPr>
       <w:bookmarkStart w:id="48" w:name="_Toc229656328"/>
+      <w:r>
+        <w:t>10.4.</w:t>
+      </w:r>
+      <w:r>
+        <w:t>5</w:t>
+      </w:r>
+      <w:r>
+        <w:t xml:space="preserve">. </w:t>
+      </w:r>
       <w:r>
         <w:t>Inflación del denominador europeo</w:t>
       </w:r>
@@ -29268,6 +29525,9 @@
       </w:pPr>
       <w:bookmarkStart w:id="49" w:name="_Toc229656329"/>
       <w:r>
+        <w:t xml:space="preserve">10.4.6. </w:t>
+      </w:r>
+      <w:r>
         <w:t>Madurez de 2025</w:t>
       </w:r>
       <w:bookmarkEnd w:id="49"/>
@@ -29628,6 +29888,24 @@
           <w:lang w:val="es-ES"/>
         </w:rPr>
         <w:lastRenderedPageBreak/>
+        <w:t>10.4.</w:t>
+      </w:r>
+      <w:r>
+        <w:rPr>
+          <w:lang w:val="es-ES"/>
+        </w:rPr>
+        <w:t>7</w:t>
+      </w:r>
+      <w:r>
+        <w:rPr>
+          <w:lang w:val="es-ES"/>
+        </w:rPr>
+        <w:t xml:space="preserve">. </w:t>
+      </w:r>
+      <w:r>
+        <w:rPr>
+          <w:lang w:val="es-ES"/>
+        </w:rPr>
         <w:t>CORE histórico sobre corpus fijo</w:t>
       </w:r>
       <w:bookmarkEnd w:id="50"/>
@@ -30545,6 +30823,15 @@
         <w:pStyle w:val="Ttulo3"/>
       </w:pPr>
       <w:bookmarkStart w:id="51" w:name="_Toc229656331"/>
+      <w:r>
+        <w:t>10.4.</w:t>
+      </w:r>
+      <w:r>
+        <w:t>8</w:t>
+      </w:r>
+      <w:r>
+        <w:t xml:space="preserve">. </w:t>
+      </w:r>
       <w:r>
         <w:t>Expansión del corpus</w:t>
       </w:r>
@@ -32341,6 +32628,24 @@
         <w:rPr>
           <w:lang w:val="es-ES"/>
         </w:rPr>
+        <w:t>10.4.</w:t>
+      </w:r>
+      <w:r>
+        <w:rPr>
+          <w:lang w:val="es-ES"/>
+        </w:rPr>
+        <w:t>9</w:t>
+      </w:r>
+      <w:r>
+        <w:rPr>
+          <w:lang w:val="es-ES"/>
+        </w:rPr>
+        <w:t xml:space="preserve">. </w:t>
+      </w:r>
+      <w:r>
+        <w:rPr>
+          <w:lang w:val="es-ES"/>
+        </w:rPr>
         <w:t>Lectura interpretativa de los análisis de robustez</w:t>
       </w:r>
       <w:bookmarkEnd w:id="52"/>
@@ -32400,7 +32705,19 @@
           <w:lang w:val="es-ES"/>
         </w:rPr>
         <w:lastRenderedPageBreak/>
-        <w:t>10.4. Colaboración internacional de la presencia española</w:t>
+        <w:t>10.</w:t>
+      </w:r>
+      <w:r>
+        <w:rPr>
+          <w:lang w:val="es-ES"/>
+        </w:rPr>
+        <w:t>5</w:t>
+      </w:r>
+      <w:r>
+        <w:rPr>
+          <w:lang w:val="es-ES"/>
+        </w:rPr>
+        <w:t>. Colaboración internacional de la presencia española</w:t>
       </w:r>
       <w:bookmarkEnd w:id="53"/>
     </w:p>
@@ -34277,8 +34594,8 @@
         <w:tblLook w:val="04A0" w:firstRow="1" w:lastRow="0" w:firstColumn="1" w:lastColumn="0" w:noHBand="0" w:noVBand="1"/>
       </w:tblPr>
       <w:tblGrid>
-        <w:gridCol w:w="1733"/>
-        <w:gridCol w:w="2433"/>
+        <w:gridCol w:w="2022"/>
+        <w:gridCol w:w="2202"/>
         <w:gridCol w:w="2343"/>
         <w:gridCol w:w="1621"/>
       </w:tblGrid>
@@ -34288,7 +34605,7 @@
         </w:trPr>
         <w:tc>
           <w:tcPr>
-            <w:tcW w:w="1733" w:type="dxa"/>
+            <w:tcW w:w="2022" w:type="dxa"/>
             <w:shd w:val="clear" w:color="auto" w:fill="D9D9D9" w:themeFill="background1" w:themeFillShade="D9"/>
             <w:vAlign w:val="center"/>
           </w:tcPr>
@@ -34311,7 +34628,7 @@
         </w:tc>
         <w:tc>
           <w:tcPr>
-            <w:tcW w:w="2433" w:type="dxa"/>
+            <w:tcW w:w="2202" w:type="dxa"/>
             <w:shd w:val="clear" w:color="auto" w:fill="D9D9D9" w:themeFill="background1" w:themeFillShade="D9"/>
             <w:vAlign w:val="center"/>
           </w:tcPr>
@@ -34388,7 +34705,7 @@
         </w:trPr>
         <w:tc>
           <w:tcPr>
-            <w:tcW w:w="1733" w:type="dxa"/>
+            <w:tcW w:w="2022" w:type="dxa"/>
             <w:vAlign w:val="center"/>
           </w:tcPr>
           <w:p>
@@ -34409,7 +34726,7 @@
         </w:tc>
         <w:tc>
           <w:tcPr>
-            <w:tcW w:w="2433" w:type="dxa"/>
+            <w:tcW w:w="2202" w:type="dxa"/>
             <w:vAlign w:val="center"/>
           </w:tcPr>
           <w:p>
@@ -34480,7 +34797,7 @@
         </w:trPr>
         <w:tc>
           <w:tcPr>
-            <w:tcW w:w="1733" w:type="dxa"/>
+            <w:tcW w:w="2022" w:type="dxa"/>
             <w:vAlign w:val="center"/>
           </w:tcPr>
           <w:p>
@@ -34501,7 +34818,7 @@
         </w:tc>
         <w:tc>
           <w:tcPr>
-            <w:tcW w:w="2433" w:type="dxa"/>
+            <w:tcW w:w="2202" w:type="dxa"/>
             <w:vAlign w:val="center"/>
           </w:tcPr>
           <w:p>
@@ -34572,7 +34889,7 @@
         </w:trPr>
         <w:tc>
           <w:tcPr>
-            <w:tcW w:w="1733" w:type="dxa"/>
+            <w:tcW w:w="2022" w:type="dxa"/>
             <w:vAlign w:val="center"/>
           </w:tcPr>
           <w:p>
@@ -34593,7 +34910,7 @@
         </w:tc>
         <w:tc>
           <w:tcPr>
-            <w:tcW w:w="2433" w:type="dxa"/>
+            <w:tcW w:w="2202" w:type="dxa"/>
             <w:vAlign w:val="center"/>
           </w:tcPr>
           <w:p>
@@ -34664,7 +34981,7 @@
         </w:trPr>
         <w:tc>
           <w:tcPr>
-            <w:tcW w:w="1733" w:type="dxa"/>
+            <w:tcW w:w="2022" w:type="dxa"/>
             <w:vAlign w:val="center"/>
           </w:tcPr>
           <w:p>
@@ -34685,7 +35002,7 @@
         </w:tc>
         <w:tc>
           <w:tcPr>
-            <w:tcW w:w="2433" w:type="dxa"/>
+            <w:tcW w:w="2202" w:type="dxa"/>
             <w:vAlign w:val="center"/>
           </w:tcPr>
           <w:p>
@@ -34756,7 +35073,7 @@
         </w:trPr>
         <w:tc>
           <w:tcPr>
-            <w:tcW w:w="1733" w:type="dxa"/>
+            <w:tcW w:w="2022" w:type="dxa"/>
             <w:vAlign w:val="center"/>
           </w:tcPr>
           <w:p>
@@ -34777,7 +35094,7 @@
         </w:tc>
         <w:tc>
           <w:tcPr>
-            <w:tcW w:w="2433" w:type="dxa"/>
+            <w:tcW w:w="2202" w:type="dxa"/>
             <w:vAlign w:val="center"/>
           </w:tcPr>
           <w:p>
@@ -34848,7 +35165,7 @@
         </w:trPr>
         <w:tc>
           <w:tcPr>
-            <w:tcW w:w="1733" w:type="dxa"/>
+            <w:tcW w:w="2022" w:type="dxa"/>
             <w:vAlign w:val="center"/>
           </w:tcPr>
           <w:p>
@@ -34865,11 +35182,18 @@
               </w:rPr>
               <w:t>Sistemas</w:t>
             </w:r>
-          </w:p>
-        </w:tc>
-        <w:tc>
-          <w:tcPr>
-            <w:tcW w:w="2433" w:type="dxa"/>
+            <w:r>
+              <w:rPr>
+                <w:sz w:val="18"/>
+                <w:szCs w:val="18"/>
+              </w:rPr>
+              <w:t>, Arq y Comp.</w:t>
+            </w:r>
+          </w:p>
+        </w:tc>
+        <w:tc>
+          <w:tcPr>
+            <w:tcW w:w="2202" w:type="dxa"/>
             <w:vAlign w:val="center"/>
           </w:tcPr>
           <w:p>
@@ -34940,7 +35264,7 @@
         </w:trPr>
         <w:tc>
           <w:tcPr>
-            <w:tcW w:w="1733" w:type="dxa"/>
+            <w:tcW w:w="2022" w:type="dxa"/>
             <w:vAlign w:val="center"/>
           </w:tcPr>
           <w:p>
@@ -34961,7 +35285,7 @@
         </w:tc>
         <w:tc>
           <w:tcPr>
-            <w:tcW w:w="2433" w:type="dxa"/>
+            <w:tcW w:w="2202" w:type="dxa"/>
             <w:vAlign w:val="center"/>
           </w:tcPr>
           <w:p>
@@ -35032,7 +35356,7 @@
         </w:trPr>
         <w:tc>
           <w:tcPr>
-            <w:tcW w:w="1733" w:type="dxa"/>
+            <w:tcW w:w="2022" w:type="dxa"/>
             <w:vAlign w:val="center"/>
           </w:tcPr>
           <w:p>
@@ -35053,7 +35377,7 @@
         </w:tc>
         <w:tc>
           <w:tcPr>
-            <w:tcW w:w="2433" w:type="dxa"/>
+            <w:tcW w:w="2202" w:type="dxa"/>
             <w:vAlign w:val="center"/>
           </w:tcPr>
           <w:p>
@@ -35147,7 +35471,19 @@
           <w:lang w:val="es-ES"/>
         </w:rPr>
         <w:lastRenderedPageBreak/>
-        <w:t>10.5. Denominadores alternativos: UE27+R</w:t>
+        <w:t>10.</w:t>
+      </w:r>
+      <w:r>
+        <w:rPr>
+          <w:lang w:val="es-ES"/>
+        </w:rPr>
+        <w:t>6</w:t>
+      </w:r>
+      <w:r>
+        <w:rPr>
+          <w:lang w:val="es-ES"/>
+        </w:rPr>
+        <w:t>. Denominadores alternativos: UE27+R</w:t>
       </w:r>
       <w:r>
         <w:rPr>
@@ -36014,7 +36350,19 @@
         <w:rPr>
           <w:lang w:val="es-ES"/>
         </w:rPr>
-        <w:t>10.6. Sensibilidad temática y congresos frontera</w:t>
+        <w:t>10.</w:t>
+      </w:r>
+      <w:r>
+        <w:rPr>
+          <w:lang w:val="es-ES"/>
+        </w:rPr>
+        <w:t>7</w:t>
+      </w:r>
+      <w:r>
+        <w:rPr>
+          <w:lang w:val="es-ES"/>
+        </w:rPr>
+        <w:t>. Sensibilidad temática y congresos frontera</w:t>
       </w:r>
       <w:bookmarkEnd w:id="55"/>
     </w:p>
@@ -36042,7 +36390,19 @@
         <w:rPr>
           <w:lang w:val="es-ES"/>
         </w:rPr>
-        <w:t xml:space="preserve"> tienen una naturaleza multidisciplinar. KDD, WWW, SIGIR, CIKM, AAAI, IJCAI o ACMMM combinan contribuciones de IA/ML, recuperación de información, web, bases de datos, sistemas, HCI o aplicaciones. Por este motivo, la capa extendida incluye un análisis de sensibilidad que reclasifica </w:t>
+        <w:t xml:space="preserve"> tienen una naturaleza multidisciplinar. KDD, WWW, SIGIR, CIKM, AAAI, IJCAI o ACMMM combinan contribuciones de IA/ML, recuperación de información, web, bases de datos, sistemas</w:t>
+      </w:r>
+      <w:r>
+        <w:rPr>
+          <w:lang w:val="es-ES"/>
+        </w:rPr>
+        <w:t>, arquitectura y computación</w:t>
+      </w:r>
+      <w:r>
+        <w:rPr>
+          <w:lang w:val="es-ES"/>
+        </w:rPr>
+        <w:t xml:space="preserve">, HCI o aplicaciones. Por este motivo, la capa extendida incluye un análisis de sensibilidad que reclasifica </w:t>
       </w:r>
       <w:r>
         <w:rPr>
@@ -36084,7 +36444,19 @@
         <w:rPr>
           <w:lang w:val="es-ES"/>
         </w:rPr>
-        <w:t>10.7. Alcance interpretativo: presencia, sistema e impacto</w:t>
+        <w:t>10.</w:t>
+      </w:r>
+      <w:r>
+        <w:rPr>
+          <w:lang w:val="es-ES"/>
+        </w:rPr>
+        <w:t>8</w:t>
+      </w:r>
+      <w:r>
+        <w:rPr>
+          <w:lang w:val="es-ES"/>
+        </w:rPr>
+        <w:t>. Alcance interpretativo: presencia, sistema e impacto</w:t>
       </w:r>
       <w:bookmarkEnd w:id="56"/>
     </w:p>
@@ -44692,7 +45064,19 @@
         <w:rPr>
           <w:lang w:val="es-ES"/>
         </w:rPr>
-        <w:t>Este paso complementa OpenAlex DOI mediante búsquedas por fuente/venue y año. Es especialmente útil para algunos congresos de IA/ML, Seguridad, Sistemas y Teoría cuando el DOI no resuelve afiliaciones.</w:t>
+        <w:t>Este paso complementa OpenAlex DOI mediante búsquedas por fuente/venue y año. Es especialmente útil para algunos congresos de IA/ML, Seguridad, Sistemas</w:t>
+      </w:r>
+      <w:r>
+        <w:rPr>
+          <w:lang w:val="es-ES"/>
+        </w:rPr>
+        <w:t>, arquitectura y computación</w:t>
+      </w:r>
+      <w:r>
+        <w:rPr>
+          <w:lang w:val="es-ES"/>
+        </w:rPr>
+        <w:t xml:space="preserve"> y Teoría cuando el DOI no resuelve afiliaciones.</w:t>
       </w:r>
     </w:p>
     <w:p>

</xml_diff>